<commit_message>
Correccion a infrastructura para practica de uso se S3 para respaldos de BD
</commit_message>
<xml_diff>
--- a/Instrucciones del Laboratorio.docx
+++ b/Instrucciones del Laboratorio.docx
@@ -815,6 +815,7 @@
         <w:rPr>
           <w:i/>
           <w:iCs/>
+          <w:lang w:val="en-US"/>
         </w:rPr>
       </w:pPr>
     </w:p>
@@ -867,14 +868,12 @@
         <w:rPr>
           <w:i/>
           <w:iCs/>
-          <w:lang w:val="en-US"/>
-        </w:rPr>
-      </w:pPr>
-      <w:r>
-        <w:rPr>
-          <w:i/>
-          <w:iCs/>
-          <w:lang w:val="en-US"/>
+        </w:rPr>
+      </w:pPr>
+      <w:r>
+        <w:rPr>
+          <w:i/>
+          <w:iCs/>
         </w:rPr>
         <w:t xml:space="preserve">0 2 * * * </w:t>
       </w:r>
@@ -883,7 +882,6 @@
         <w:rPr>
           <w:i/>
           <w:iCs/>
-          <w:lang w:val="en-US"/>
         </w:rPr>
         <w:t>mysqldump</w:t>
       </w:r>
@@ -892,16 +890,62 @@
         <w:rPr>
           <w:i/>
           <w:iCs/>
-          <w:lang w:val="en-US"/>
-        </w:rPr>
-        <w:t xml:space="preserve"> -h &lt;endpoint&gt; -u admin -pAdmin1234! --all-databases &gt; </w:t>
-      </w:r>
-      <w:proofErr w:type="spellStart"/>
-      <w:r>
-        <w:rPr>
-          <w:i/>
-          <w:iCs/>
-          <w:lang w:val="en-US"/>
+        </w:rPr>
+        <w:t xml:space="preserve"> -h &lt;</w:t>
+      </w:r>
+      <w:proofErr w:type="spellStart"/>
+      <w:r>
+        <w:rPr>
+          <w:i/>
+          <w:iCs/>
+        </w:rPr>
+        <w:t>endpoint</w:t>
+      </w:r>
+      <w:proofErr w:type="spellEnd"/>
+      <w:r>
+        <w:rPr>
+          <w:i/>
+          <w:iCs/>
+        </w:rPr>
+        <w:t xml:space="preserve">&gt; -u </w:t>
+      </w:r>
+      <w:proofErr w:type="spellStart"/>
+      <w:r>
+        <w:rPr>
+          <w:i/>
+          <w:iCs/>
+        </w:rPr>
+        <w:t>admin</w:t>
+      </w:r>
+      <w:proofErr w:type="spellEnd"/>
+      <w:r>
+        <w:rPr>
+          <w:i/>
+          <w:iCs/>
+        </w:rPr>
+        <w:t xml:space="preserve"> -pAdmin1234! --</w:t>
+      </w:r>
+      <w:proofErr w:type="spellStart"/>
+      <w:r>
+        <w:rPr>
+          <w:i/>
+          <w:iCs/>
+        </w:rPr>
+        <w:t>all-databases</w:t>
+      </w:r>
+      <w:proofErr w:type="spellEnd"/>
+      <w:r>
+        <w:rPr>
+          <w:i/>
+          <w:iCs/>
+        </w:rPr>
+        <w:t xml:space="preserve"> &gt; </w:t>
+      </w:r>
+      <w:proofErr w:type="spellStart"/>
+      <w:r>
+        <w:rPr>
+          <w:i/>
+          <w:iCs/>
         </w:rPr>
         <w:t>backup.sql</w:t>
       </w:r>
@@ -910,7 +954,6 @@
         <w:rPr>
           <w:i/>
           <w:iCs/>
-          <w:lang w:val="en-US"/>
         </w:rPr>
         <w:t xml:space="preserve"> &amp;&amp; </w:t>
       </w:r>
@@ -919,7 +962,6 @@
         <w:rPr>
           <w:i/>
           <w:iCs/>
-          <w:lang w:val="en-US"/>
         </w:rPr>
         <w:t>aws</w:t>
       </w:r>
@@ -928,17 +970,45 @@
         <w:rPr>
           <w:i/>
           <w:iCs/>
-          <w:lang w:val="en-US"/>
-        </w:rPr>
-        <w:t xml:space="preserve"> s3 cp backup.</w:t>
-      </w:r>
-    </w:p>
-    <w:p>
-      <w:pPr>
-        <w:spacing w:after="0"/>
-        <w:rPr>
-          <w:lang w:val="en-US"/>
-        </w:rPr>
+        </w:rPr>
+        <w:t xml:space="preserve"> s3 </w:t>
+      </w:r>
+      <w:proofErr w:type="spellStart"/>
+      <w:r>
+        <w:rPr>
+          <w:i/>
+          <w:iCs/>
+        </w:rPr>
+        <w:t>cp</w:t>
+      </w:r>
+      <w:proofErr w:type="spellEnd"/>
+      <w:r>
+        <w:rPr>
+          <w:i/>
+          <w:iCs/>
+        </w:rPr>
+        <w:t xml:space="preserve"> </w:t>
+      </w:r>
+      <w:proofErr w:type="spellStart"/>
+      <w:r>
+        <w:rPr>
+          <w:i/>
+          <w:iCs/>
+        </w:rPr>
+        <w:t>backup</w:t>
+      </w:r>
+      <w:proofErr w:type="spellEnd"/>
+      <w:r>
+        <w:rPr>
+          <w:i/>
+          <w:iCs/>
+        </w:rPr>
+        <w:t>.</w:t>
+      </w:r>
+    </w:p>
+    <w:p>
+      <w:pPr>
+        <w:spacing w:after="0"/>
       </w:pPr>
     </w:p>
     <w:p>
@@ -2748,6 +2818,7 @@
   <w:style w:type="character" w:default="1" w:styleId="Fuentedeprrafopredeter">
     <w:name w:val="Default Paragraph Font"/>
     <w:uiPriority w:val="1"/>
+    <w:semiHidden/>
     <w:unhideWhenUsed/>
   </w:style>
   <w:style w:type="table" w:default="1" w:styleId="Tablanormal">

</xml_diff>